<commit_message>
fix(vla-resume): capitalize Imitation Learning in tech stack bullet
Co-Authored-By: Claude Sonnet 4.6 <noreply@anthropic.com>
</commit_message>
<xml_diff>
--- a/Alex Nettekoven Resume VLA-Standard.docx
+++ b/Alex Nettekoven Resume VLA-Standard.docx
@@ -366,7 +366,7 @@
           <w:szCs w:val="22"/>
           <w:rtl w:val="0"/>
         </w:rPr>
-        <w:t>Developing, fine-tuning, and deploying robot foundation models for manipulation tasks, including VLA models and world action models, under real-time deployment constraints:</w:t>
+        <w:t>Developing, fine-tuning, and deploying robot foundation models for manipulation tasks, including VLA models and World Action Models, under real-time deployment constraints:</w:t>
       </w:r>
     </w:p>
     <w:p>
@@ -637,7 +637,7 @@
           <w:szCs w:val="22"/>
           <w:rtl w:val="0"/>
         </w:rPr>
-        <w:t>Tech stack: Multi-agent RL (QMIX); imitation learning for warm-starting policies with expert demonstrations; LLMs for human-machine interfacing</w:t>
+        <w:t>Tech stack: Multi-agent RL (QMIX); Imitation Learning for warm-starting policies with expert demonstrations; LLMs for human-machine interfacing</w:t>
       </w:r>
     </w:p>
     <w:p>
@@ -1430,7 +1430,7 @@
           <w:szCs w:val="22"/>
           <w:rtl w:val="0"/>
         </w:rPr>
-        <w:t>Robot Learning &amp; Foundation Models: DreamZero, pi0.5, SmolVLA, ACT, Diffusion Policies, Reinforcement Learning (PPO, QMIX); Transformers (DiT, ViT); Behavior Cloning / Imitation Learning (BC, DAgger, teacher-student learning); Machine Learning; VLMs (SigLIP, Qwen-VL, PaliGemma)</w:t>
+        <w:t>Robot Learning &amp; Foundation Models: DreamZero, pi0.5, SmolVLA, ACT, Diffusion Policies, Reinforcement Learning (PPO, QMIX); Transformers (DiT, ViT); Behavior Cloning / Imitation Learning (BC, DAgger, Teacher-Student Learning); Machine Learning; VLMs (SigLIP, Qwen-VL, PaliGemma)</w:t>
       </w:r>
     </w:p>
     <w:p>
@@ -1535,7 +1535,7 @@
           <w:szCs w:val="22"/>
           <w:rtl w:val="0"/>
         </w:rPr>
-        <w:t xml:space="preserve">Team: Product and project management; technical leadership; team building and hiring; technical communication and presentations</w:t>
+        <w:t xml:space="preserve">Team: Product and Project Management; Technical Leadership; Team Building and Hiring; Technical Communication and Presentations</w:t>
       </w:r>
     </w:p>
     <w:p>

</xml_diff>